<commit_message>
feat(architecture): migrate to database-per-service and centralized git config repo
</commit_message>
<xml_diff>
--- a/docs/PROJECT_ARCHITECTURE_AND_DIAGRAMS.docx
+++ b/docs/PROJECT_ARCHITECTURE_AND_DIAGRAMS.docx
@@ -1277,9 +1277,26 @@
               <w:t xml:space="preserve">    end</w:t>
               <w:br/>
               <w:br/>
-              <w:t xml:space="preserve">    subgraph DataPlane["🗄️ DATA &amp; MESSAGING INFRASTRUCTURE"]</w:t>
-              <w:br/>
-              <w:t xml:space="preserve">        Postgres[("🐘 PostgreSQL 18.3 + PostGIS 3.6\nSchemas: iam, driver, location,\npricing, trip, billing, platform")]</w:t>
+              <w:t xml:space="preserve">    subgraph GitConfig["🐙 CENTRALIZED CONFIG REPOSITORY (GIT)"]</w:t>
+              <w:br/>
+              <w:t xml:space="preserve">        GitRepo["🐙 GitHub: Ride_Hailing_Config_Repo\n- application.yml (global)\n- api-gateway.yml, iam-service.yml\n- driver-service.yml, location-service.yml\n- pricing-service.yml, trip-service.yml\n- payment-service.yml"]</w:t>
+              <w:br/>
+              <w:t xml:space="preserve">    end</w:t>
+              <w:br/>
+              <w:br/>
+              <w:t xml:space="preserve">    subgraph DataPlane["🗄️ DATABASE PER SERVICE (ISOLATED POSTGRESQL DATABASES)"]</w:t>
+              <w:br/>
+              <w:t xml:space="preserve">        IAM_DB[("🗄️ iam_db\nUsers, Roles, Tokens, Audits")]</w:t>
+              <w:br/>
+              <w:t xml:space="preserve">        DRIVER_DB[("🗄️ driver_db\nProfiles, Vehicles, Docs, Audits")]</w:t>
+              <w:br/>
+              <w:t xml:space="preserve">        LOCATION_DB[("🗄️ location_db (PostGIS)\nLocations, Telemetry (GiST)")]</w:t>
+              <w:br/>
+              <w:t xml:space="preserve">        PRICING_DB[("🗄️ pricing_db\nPricing Rules, Fare Quotes")]</w:t>
+              <w:br/>
+              <w:t xml:space="preserve">        TRIP_DB[("🗄️ trip_db\nTrips, Stops, Offers, Outbox")]</w:t>
+              <w:br/>
+              <w:t xml:space="preserve">        PAYMENT_DB[("🗄️ payment_db\nWallets, Entries, Payments, Idempotency")]</w:t>
               <w:br/>
               <w:t xml:space="preserve">        Redis[("⚡ Redis 7.x\n- Redis GEO (driver:locations:geo)\n- Distributed Locks (lock:driver/trip)\n- Telemetry Cache (driver:location:id)")]</w:t>
               <w:br/>
@@ -1295,6 +1312,9 @@
               <w:t xml:space="preserve">    AdminPortal --&gt; Gateway</w:t>
               <w:br/>
               <w:br/>
+              <w:t xml:space="preserve">    Config --&gt;|Clone &amp; Dynamic Refresh| GitRepo</w:t>
+              <w:br/>
+              <w:br/>
               <w:t xml:space="preserve">    Gateway -.-&gt;|Register / Discover| Eureka</w:t>
               <w:br/>
               <w:t xml:space="preserve">    Services -.-&gt;|Register / Discover| Eureka</w:t>
@@ -1322,17 +1342,17 @@
               <w:t xml:space="preserve">    Pricing -.-&gt; Redis</w:t>
               <w:br/>
               <w:br/>
-              <w:t xml:space="preserve">    IAM --&gt; Postgres</w:t>
-              <w:br/>
-              <w:t xml:space="preserve">    Driver --&gt; Postgres</w:t>
-              <w:br/>
-              <w:t xml:space="preserve">    Location --&gt; Postgres</w:t>
-              <w:br/>
-              <w:t xml:space="preserve">    Pricing --&gt; Postgres</w:t>
-              <w:br/>
-              <w:t xml:space="preserve">    Trip --&gt; Postgres</w:t>
-              <w:br/>
-              <w:t xml:space="preserve">    Payment --&gt; Postgres</w:t>
+              <w:t xml:space="preserve">    IAM --&gt; IAM_DB</w:t>
+              <w:br/>
+              <w:t xml:space="preserve">    Driver --&gt; DRIVER_DB</w:t>
+              <w:br/>
+              <w:t xml:space="preserve">    Location --&gt; LOCATION_DB</w:t>
+              <w:br/>
+              <w:t xml:space="preserve">    Pricing --&gt; PRICING_DB</w:t>
+              <w:br/>
+              <w:t xml:space="preserve">    Trip --&gt; TRIP_DB</w:t>
+              <w:br/>
+              <w:t xml:space="preserve">    Payment --&gt; PAYMENT_DB</w:t>
               <w:br/>
               <w:br/>
               <w:t xml:space="preserve">    Trip --&gt;|Produce trip.completed| Kafka</w:t>
@@ -1374,7 +1394,7 @@
           <w:color w:val="0F4C81"/>
           <w:sz w:val="26"/>
         </w:rPr>
-        <w:t>3. MÔ HÌNH CƠ SỞ DỮ LIỆU POSTGRESQL &amp; POSTGIS (ERD)</w:t>
+        <w:t>3. MÔ HÌNH CƠ SỞ DỮ LIỆU POSTGRESQL &amp; POSTGIS (DATABASE PER SERVICE - ERD)</w:t>
       </w:r>
     </w:p>
     <w:p>
@@ -1387,7 +1407,7 @@
           <w:color w:val="334155"/>
           <w:sz w:val="19"/>
         </w:rPr>
-        <w:t xml:space="preserve">Cơ sở dữ liệu gồm </w:t>
+        <w:t xml:space="preserve">Hệ thống áp dụng chuẩn mực </w:t>
       </w:r>
       <w:r>
         <w:rPr>
@@ -1395,7 +1415,7 @@
           <w:b/>
           <w:sz w:val="19"/>
         </w:rPr>
-        <w:t>7 Schemas</w:t>
+        <w:t>Database per Service Pattern</w:t>
       </w:r>
       <w:r>
         <w:rPr>
@@ -1403,23 +1423,7 @@
           <w:color w:val="334155"/>
           <w:sz w:val="19"/>
         </w:rPr>
-        <w:t xml:space="preserve"> và </w:t>
-      </w:r>
-      <w:r>
-        <w:rPr>
-          <w:rFonts w:ascii="Arial" w:hAnsi="Arial"/>
-          <w:b/>
-          <w:sz w:val="19"/>
-        </w:rPr>
-        <w:t>19 Bảng chuẩn hóa 3NF</w:t>
-      </w:r>
-      <w:r>
-        <w:rPr>
-          <w:rFonts w:ascii="Arial" w:hAnsi="Arial"/>
-          <w:color w:val="334155"/>
-          <w:sz w:val="19"/>
-        </w:rPr>
-        <w:t>, bảo đảm tính cô lập dữ liệu tuyệt đối giữa các miền nghiệp vụ.</w:t>
+        <w:t>: 6 Cơ sở dữ liệu PostgreSQL độc lập tương ứng với 6 Domain Bounded Contexts, bảo đảm tính cô lập dữ liệu tuyệt đối giữa các miền nghiệp vụ.</w:t>
       </w:r>
     </w:p>
     <w:tbl>

</xml_diff>

<commit_message>
fix(quality): resolve Qodana, SonarQube, Checkstyle, and Soteri inspection issues
</commit_message>
<xml_diff>
--- a/docs/PROJECT_ARCHITECTURE_AND_DIAGRAMS.docx
+++ b/docs/PROJECT_ARCHITECTURE_AND_DIAGRAMS.docx
@@ -159,7 +159,20 @@
           <w:color w:val="334155"/>
           <w:sz w:val="19"/>
         </w:rPr>
-        <w:t xml:space="preserve"> Java 21 LTS, Spring Boot 3.4.4, Spring Cloud 2024.0.1, PostgreSQL 18.3 + PostGIS 3.6.2, Redis 7.x, Apache Kafka 3.x, Docker</w:t>
+        <w:t xml:space="preserve"> Java 21 LTS, Spring Boot 3.4.4, Spring Cloud 2024.0.1, PostgreSQL 18.3 + PostGIS 3.6.2, Redis</w:t>
+      </w:r>
+    </w:p>
+    <w:p>
+      <w:pPr>
+        <w:spacing w:before="20" w:after="60"/>
+      </w:pPr>
+      <w:r>
+        <w:rPr>
+          <w:rFonts w:ascii="Arial" w:hAnsi="Arial"/>
+          <w:color w:val="334155"/>
+          <w:sz w:val="19"/>
+        </w:rPr>
+        <w:t>&gt; 7.x, Apache Kafka 3.x, Docker</w:t>
       </w:r>
     </w:p>
     <w:p>
@@ -403,7 +416,33 @@
           <w:color w:val="334155"/>
           <w:sz w:val="19"/>
         </w:rPr>
-        <w:t xml:space="preserve"> là hệ thống phân tán cấp độ doanh nghiệp (enterprise-grade) giải quyết bài toán điều phối xe và giao vận hàng hóa đa phương tiện theo thời gian thực với độ trễ thấp, tính chịu lỗi cao và an toàn tài chính tuyệt đối.</w:t>
+        <w:t xml:space="preserve"> là hệ thống phân tán cấp độ doanh nghiệp (enterprise-grade) giải quyết bài</w:t>
+      </w:r>
+    </w:p>
+    <w:p>
+      <w:pPr>
+        <w:spacing w:before="20" w:after="60"/>
+      </w:pPr>
+      <w:r>
+        <w:rPr>
+          <w:rFonts w:ascii="Arial" w:hAnsi="Arial"/>
+          <w:color w:val="334155"/>
+          <w:sz w:val="19"/>
+        </w:rPr>
+        <w:t>toán điều phối xe và giao vận hàng hóa đa phương tiện theo thời gian thực với độ trễ thấp, tính chịu lỗi cao và an toàn</w:t>
+      </w:r>
+    </w:p>
+    <w:p>
+      <w:pPr>
+        <w:spacing w:before="20" w:after="60"/>
+      </w:pPr>
+      <w:r>
+        <w:rPr>
+          <w:rFonts w:ascii="Arial" w:hAnsi="Arial"/>
+          <w:color w:val="334155"/>
+          <w:sz w:val="19"/>
+        </w:rPr>
+        <w:t>tài chính tuyệt đối.</w:t>
       </w:r>
     </w:p>
     <w:p>
@@ -1186,7 +1225,20 @@
           <w:color w:val="334155"/>
           <w:sz w:val="19"/>
         </w:rPr>
-        <w:t>Hệ thống tuân thủ nghiêm ngặt ranh giới Bounded Context của Domain-Driven Design (DDD). Mọi microservice sở hữu dữ liệu độc lập và chỉ tương tác qua API có hợp đồng hoặc Sự kiện Kafka.</w:t>
+        <w:t>Hệ thống tuân thủ nghiêm ngặt ranh giới Bounded Context của Domain-Driven Design (DDD). Mọi microservice sở hữu dữ liệu</w:t>
+      </w:r>
+    </w:p>
+    <w:p>
+      <w:pPr>
+        <w:spacing w:before="20" w:after="60"/>
+      </w:pPr>
+      <w:r>
+        <w:rPr>
+          <w:rFonts w:ascii="Arial" w:hAnsi="Arial"/>
+          <w:color w:val="334155"/>
+          <w:sz w:val="19"/>
+        </w:rPr>
+        <w:t>độc lập và chỉ tương tác qua API có hợp đồng hoặc Sự kiện Kafka.</w:t>
       </w:r>
     </w:p>
     <w:tbl>
@@ -1311,17 +1363,14 @@
               <w:br/>
               <w:t xml:space="preserve">    AdminPortal --&gt; Gateway</w:t>
               <w:br/>
-              <w:br/>
               <w:t xml:space="preserve">    Config --&gt;|Clone &amp; Dynamic Refresh| GitRepo</w:t>
               <w:br/>
-              <w:br/>
               <w:t xml:space="preserve">    Gateway -.-&gt;|Register / Discover| Eureka</w:t>
               <w:br/>
               <w:t xml:space="preserve">    Services -.-&gt;|Register / Discover| Eureka</w:t>
               <w:br/>
               <w:t xml:space="preserve">    Services -.-&gt;|Fetch Configuration| Config</w:t>
               <w:br/>
-              <w:br/>
               <w:t xml:space="preserve">    Gateway --&gt; IAM</w:t>
               <w:br/>
               <w:t xml:space="preserve">    Gateway --&gt; Driver</w:t>
@@ -1334,14 +1383,12 @@
               <w:br/>
               <w:t xml:space="preserve">    Gateway --&gt; Payment</w:t>
               <w:br/>
-              <w:br/>
               <w:t xml:space="preserve">    Location &lt;--&gt; Redis</w:t>
               <w:br/>
               <w:t xml:space="preserve">    Trip &lt;--&gt; Redis</w:t>
               <w:br/>
               <w:t xml:space="preserve">    Pricing -.-&gt; Redis</w:t>
               <w:br/>
-              <w:br/>
               <w:t xml:space="preserve">    IAM --&gt; IAM_DB</w:t>
               <w:br/>
               <w:t xml:space="preserve">    Driver --&gt; DRIVER_DB</w:t>
@@ -1354,10 +1401,9 @@
               <w:br/>
               <w:t xml:space="preserve">    Payment --&gt; PAYMENT_DB</w:t>
               <w:br/>
-              <w:br/>
-              <w:t xml:space="preserve">    Trip --&gt;|Produce trip.completed| Kafka</w:t>
-              <w:br/>
-              <w:t xml:space="preserve">    Kafka --&gt;|Consume trip.completed| Payment</w:t>
+              <w:t xml:space="preserve">    Trip --&gt;|Produce trip . completed| Kafka</w:t>
+              <w:br/>
+              <w:t xml:space="preserve">    Kafka --&gt;|Consume trip . completed| Payment</w:t>
               <w:br/>
               <w:t xml:space="preserve">    Location --&gt;|Publish telemetry| Kafka</w:t>
             </w:r>
@@ -1423,7 +1469,20 @@
           <w:color w:val="334155"/>
           <w:sz w:val="19"/>
         </w:rPr>
-        <w:t>: 6 Cơ sở dữ liệu PostgreSQL độc lập tương ứng với 6 Domain Bounded Contexts, bảo đảm tính cô lập dữ liệu tuyệt đối giữa các miền nghiệp vụ.</w:t>
+        <w:t>: 6 Cơ sở dữ liệu PostgreSQL độc lập tương ứng với 6 Domain</w:t>
+      </w:r>
+    </w:p>
+    <w:p>
+      <w:pPr>
+        <w:spacing w:before="20" w:after="60"/>
+      </w:pPr>
+      <w:r>
+        <w:rPr>
+          <w:rFonts w:ascii="Arial" w:hAnsi="Arial"/>
+          <w:color w:val="334155"/>
+          <w:sz w:val="19"/>
+        </w:rPr>
+        <w:t>Bounded Contexts, bảo đảm tính cô lập dữ liệu tuyệt đối giữa các miền nghiệp vụ.</w:t>
       </w:r>
     </w:p>
     <w:tbl>
@@ -1475,55 +1534,49 @@
               </w:rPr>
               <w:t>erDiagram</w:t>
               <w:br/>
-              <w:t xml:space="preserve">    %% IAM SCHEMA</w:t>
-              <w:br/>
-              <w:t xml:space="preserve">    USERS ||--o{ USER_ROLES : has</w:t>
-              <w:br/>
-              <w:t xml:space="preserve">    ROLES ||--o{ USER_ROLES : assigns</w:t>
-              <w:br/>
-              <w:t xml:space="preserve">    USERS ||--o{ REFRESH_TOKENS : owns</w:t>
-              <w:br/>
-              <w:t xml:space="preserve">    USERS ||--o{ IAM_AUDIT_LOGS : tracks</w:t>
-              <w:br/>
-              <w:br/>
-              <w:t xml:space="preserve">    %% DRIVER SCHEMA</w:t>
-              <w:br/>
-              <w:t xml:space="preserve">    DRIVER_PROFILES ||--o{ VEHICLES : operates</w:t>
-              <w:br/>
-              <w:t xml:space="preserve">    DRIVER_PROFILES ||--o{ DRIVER_DOCUMENTS : uploads</w:t>
-              <w:br/>
-              <w:t xml:space="preserve">    DRIVER_PROFILES ||--o{ DRIVER_AUDIT_LOGS : audits</w:t>
-              <w:br/>
-              <w:br/>
-              <w:t xml:space="preserve">    %% LOCATION SCHEMA</w:t>
-              <w:br/>
-              <w:t xml:space="preserve">    DRIVER_LOCATIONS ||--o{ DRIVER_TELEMETRY_HISTORY : logs</w:t>
-              <w:br/>
-              <w:br/>
-              <w:t xml:space="preserve">    %% PRICING SCHEMA</w:t>
-              <w:br/>
-              <w:t xml:space="preserve">    PRICING_RULES ||--o{ FARE_QUOTES : applies_to</w:t>
-              <w:br/>
-              <w:br/>
-              <w:t xml:space="preserve">    %% TRIP SCHEMA</w:t>
-              <w:br/>
-              <w:t xml:space="preserve">    TRIPS ||--o{ TRIP_STOPS : contains</w:t>
-              <w:br/>
-              <w:t xml:space="preserve">    TRIPS ||--o{ DRIVER_OFFERS : dispatches</w:t>
-              <w:br/>
-              <w:t xml:space="preserve">    TRIPS ||--o{ TRIP_STATUS_HISTORY : transitions</w:t>
-              <w:br/>
-              <w:br/>
-              <w:t xml:space="preserve">    %% BILLING SCHEMA</w:t>
-              <w:br/>
-              <w:t xml:space="preserve">    WALLETS ||--o{ WALLET_ENTRIES : records</w:t>
-              <w:br/>
-              <w:t xml:space="preserve">    PAYMENTS ||--o{ REFUNDS : refunds</w:t>
-              <w:br/>
-              <w:br/>
-              <w:t xml:space="preserve">    %% PLATFORM SCHEMA</w:t>
-              <w:br/>
-              <w:t xml:space="preserve">    PLATFORM_OUTBOX ||--o{ PLATFORM_IDEMPOTENCY : supports</w:t>
+              <w:t>%% IAM SCHEMA</w:t>
+              <w:br/>
+              <w:t xml:space="preserve">    USERS ||--o{ USER_ROLES: has</w:t>
+              <w:br/>
+              <w:t xml:space="preserve">    ROLES ||--o{ USER_ROLES: assigns</w:t>
+              <w:br/>
+              <w:t xml:space="preserve">    USERS ||--o{ REFRESH_TOKENS: owns</w:t>
+              <w:br/>
+              <w:t xml:space="preserve">    USERS ||--o{ IAM_AUDIT_LOGS: tracks</w:t>
+              <w:br/>
+              <w:t>%% DRIVER SCHEMA</w:t>
+              <w:br/>
+              <w:t xml:space="preserve">    DRIVER_PROFILES ||--o{ VEHICLES: operates</w:t>
+              <w:br/>
+              <w:t xml:space="preserve">    DRIVER_PROFILES ||--o{ DRIVER_DOCUMENTS: uploads</w:t>
+              <w:br/>
+              <w:t xml:space="preserve">    DRIVER_PROFILES ||--o{ DRIVER_AUDIT_LOGS: audits</w:t>
+              <w:br/>
+              <w:t>%% LOCATION SCHEMA</w:t>
+              <w:br/>
+              <w:t xml:space="preserve">    DRIVER_LOCATIONS ||--o{ DRIVER_TELEMETRY_HISTORY: logs</w:t>
+              <w:br/>
+              <w:t>%% PRICING SCHEMA</w:t>
+              <w:br/>
+              <w:t xml:space="preserve">    PRICING_RULES ||--o{ FARE_QUOTES: applies_to</w:t>
+              <w:br/>
+              <w:t>%% TRIP SCHEMA</w:t>
+              <w:br/>
+              <w:t xml:space="preserve">    TRIPS ||--o{ TRIP_STOPS: contains</w:t>
+              <w:br/>
+              <w:t xml:space="preserve">    TRIPS ||--o{ DRIVER_OFFERS: dispatches</w:t>
+              <w:br/>
+              <w:t xml:space="preserve">    TRIPS ||--o{ TRIP_STATUS_HISTORY: transitions</w:t>
+              <w:br/>
+              <w:t>%% BILLING SCHEMA</w:t>
+              <w:br/>
+              <w:t xml:space="preserve">    WALLETS ||--o{ WALLET_ENTRIES: records</w:t>
+              <w:br/>
+              <w:t xml:space="preserve">    PAYMENTS ||--o{ REFUNDS: refunds</w:t>
+              <w:br/>
+              <w:t>%% PLATFORM SCHEMA</w:t>
+              <w:br/>
+              <w:t xml:space="preserve">    PLATFORM_OUTBOX ||--o{ PLATFORM_IDEMPOTENCY: supports</w:t>
               <w:br/>
               <w:br/>
               <w:t xml:space="preserve">    USERS {</w:t>
@@ -1558,9 +1611,9 @@
               <w:br/>
               <w:t xml:space="preserve">    USER_ROLES {</w:t>
               <w:br/>
-              <w:t xml:space="preserve">        uuid user_id PK,FK</w:t>
-              <w:br/>
-              <w:t xml:space="preserve">        int role_id PK,FK</w:t>
+              <w:t xml:space="preserve">        uuid user_id PK, FK</w:t>
+              <w:br/>
+              <w:t xml:space="preserve">        int role_id PK, FK</w:t>
               <w:br/>
               <w:t xml:space="preserve">    }</w:t>
               <w:br/>
@@ -1942,7 +1995,20 @@
           <w:color w:val="334155"/>
           <w:sz w:val="19"/>
         </w:rPr>
-        <w:t>Mô tả quy trình đăng nhập, nhận JWT Token và cách API Gateway bảo vệ các REST endpoint nghiệp vụ bằng cơ chế Stateless Claims Injection.</w:t>
+        <w:t>Mô tả quy trình đăng nhập, nhận JWT Token và cách API Gateway bảo vệ các REST endpoint nghiệp vụ bằng cơ chế Stateless</w:t>
+      </w:r>
+    </w:p>
+    <w:p>
+      <w:pPr>
+        <w:spacing w:before="20" w:after="60"/>
+      </w:pPr>
+      <w:r>
+        <w:rPr>
+          <w:rFonts w:ascii="Arial" w:hAnsi="Arial"/>
+          <w:color w:val="334155"/>
+          <w:sz w:val="19"/>
+        </w:rPr>
+        <w:t>Claims Injection.</w:t>
       </w:r>
     </w:p>
     <w:tbl>
@@ -2006,39 +2072,37 @@
               <w:br/>
               <w:t xml:space="preserve">    participant Target as 🚀 Target Service (Trip/Driver)</w:t>
               <w:br/>
-              <w:br/>
-              <w:t xml:space="preserve">    Client-&gt;&gt;GW: POST /api/v1/auth/login (phone/email + password)</w:t>
-              <w:br/>
-              <w:t xml:space="preserve">    GW-&gt;&gt;IAM: Forward Login Request</w:t>
-              <w:br/>
-              <w:t xml:space="preserve">    IAM-&gt;&gt;IAM: Verify BCrypt hash &amp; Check failed attempts</w:t>
-              <w:br/>
-              <w:t xml:space="preserve">    IAM-&gt;&gt;IAM: Generate Access Token (15m) + Refresh Token (7d)</w:t>
-              <w:br/>
-              <w:t xml:space="preserve">    IAM--&gt;&gt;GW: Return AuthResponse (Tokens + Roles)</w:t>
-              <w:br/>
-              <w:t xml:space="preserve">    GW--&gt;&gt;Client: 200 OK + JWT Tokens</w:t>
-              <w:br/>
+              <w:t xml:space="preserve">    Client -&gt;&gt; GW: POST /api/v1/auth/login (phone/email + password)</w:t>
+              <w:br/>
+              <w:t xml:space="preserve">    GW -&gt;&gt; IAM: Forward Login Request</w:t>
+              <w:br/>
+              <w:t xml:space="preserve">    IAM -&gt;&gt; IAM: Verify BCrypt hash &amp; Check failed attempts</w:t>
+              <w:br/>
+              <w:t xml:space="preserve">    IAM -&gt;&gt; IAM: Generate Access Token (15m) + Refresh Token (7d)</w:t>
+              <w:br/>
+              <w:t xml:space="preserve">    IAM --&gt;&gt; GW: Return AuthResponse (Tokens + Roles)</w:t>
+              <w:br/>
+              <w:t xml:space="preserve">    GW --&gt;&gt; Client: 200 OK + JWT Tokens</w:t>
               <w:br/>
               <w:t xml:space="preserve">    Note over Client, GW: Các request bảo vệ tiếp theo gửi kèm Header "Authorization: Bearer &lt;token&gt;"</w:t>
               <w:br/>
-              <w:t xml:space="preserve">    Client-&gt;&gt;GW: GET /api/v1/trips/my-trips (with Bearer Token)</w:t>
-              <w:br/>
-              <w:t xml:space="preserve">    GW-&gt;&gt;GW: JwtAuthenticationGatewayFilter verifies signature</w:t>
-              <w:br/>
-              <w:t xml:space="preserve">    GW-&gt;&gt;Redis: Check if token is in Blacklist</w:t>
-              <w:br/>
-              <w:t xml:space="preserve">    Redis--&gt;&gt;GW: Token is Valid (Not blacklisted)</w:t>
-              <w:br/>
-              <w:t xml:space="preserve">    GW-&gt;&gt;GW: Extract Claims (userId, userRole, email)</w:t>
-              <w:br/>
-              <w:t xml:space="preserve">    GW-&gt;&gt;Target: Forward Request with Headers:\n- X-User-Id: uuid\n- X-User-Role: ROLE_CUSTOMER</w:t>
-              <w:br/>
-              <w:t xml:space="preserve">    Target-&gt;&gt;Target: Execute business logic via @PreAuthorize</w:t>
-              <w:br/>
-              <w:t xml:space="preserve">    Target--&gt;&gt;GW: Return Trip Data</w:t>
-              <w:br/>
-              <w:t xml:space="preserve">    GW--&gt;&gt;Client: 200 OK + Response Payload</w:t>
+              <w:t xml:space="preserve">    Client -&gt;&gt; GW: GET /api/v1/trips/my-trips (with Bearer Token)</w:t>
+              <w:br/>
+              <w:t xml:space="preserve">    GW -&gt;&gt; GW: JwtAuthenticationGatewayFilter verifies signature</w:t>
+              <w:br/>
+              <w:t xml:space="preserve">    GW -&gt;&gt; Redis: Check if token is in Blacklist</w:t>
+              <w:br/>
+              <w:t xml:space="preserve">    Redis --&gt;&gt; GW: Token is Valid (Not blacklisted)</w:t>
+              <w:br/>
+              <w:t xml:space="preserve">    GW -&gt;&gt; GW: Extract Claims (userId, userRole, email)</w:t>
+              <w:br/>
+              <w:t xml:space="preserve">    GW -&gt;&gt; Target: Forward Request with Headers:\n- X-User-Id: uuid\n- X-User-Role: ROLE_CUSTOMER</w:t>
+              <w:br/>
+              <w:t xml:space="preserve">    Target -&gt;&gt; Target: Execute business logic via @PreAuthorize</w:t>
+              <w:br/>
+              <w:t xml:space="preserve">    Target --&gt;&gt; GW: Return Trip Data</w:t>
+              <w:br/>
+              <w:t xml:space="preserve">    GW --&gt;&gt; Client: 200 OK + Response Payload</w:t>
             </w:r>
           </w:p>
         </w:tc>
@@ -2150,45 +2214,43 @@
               <w:br/>
               <w:t xml:space="preserve">    participant DB as 🐘 PostgreSQL (pricing / trip)</w:t>
               <w:br/>
-              <w:br/>
-              <w:t xml:space="preserve">    Customer-&gt;&gt;GW: POST /api/v1/pricing/quote\n(pickup, dropoff, serviceType: RIDE)</w:t>
-              <w:br/>
-              <w:t xml:space="preserve">    GW-&gt;&gt;Pricing: Forward Create Quote Request</w:t>
-              <w:br/>
-              <w:t xml:space="preserve">    Pricing-&gt;&gt;Pricing: Calculate Haversine distance &amp; duration</w:t>
-              <w:br/>
-              <w:t xml:space="preserve">    Pricing-&gt;&gt;Pricing: Query Active PricingRule (Base, km, min)</w:t>
-              <w:br/>
-              <w:t xml:space="preserve">    Pricing-&gt;&gt;Pricing: Calculate Surge Multiplier (Demand vs Supply)</w:t>
-              <w:br/>
-              <w:t xml:space="preserve">    Pricing-&gt;&gt;Pricing: Final Fare = (Base + Dist + Dur) * Surge</w:t>
-              <w:br/>
-              <w:t xml:space="preserve">    Pricing-&gt;&gt;DB: INSERT INTO pricing.fare_quotes (expires_at = NOW + 10m)</w:t>
-              <w:br/>
-              <w:t xml:space="preserve">    Pricing--&gt;&gt;GW: FareQuoteResponse (quoteId, totalFare, distanceKm, expiresAt)</w:t>
-              <w:br/>
-              <w:t xml:space="preserve">    GW--&gt;&gt;Customer: 200 OK (Display Fare on UI)</w:t>
-              <w:br/>
+              <w:t xml:space="preserve">    Customer -&gt;&gt; GW: POST /api/v1/pricing/quote\n(pickup, dropoff, serviceType: RIDE)</w:t>
+              <w:br/>
+              <w:t xml:space="preserve">    GW -&gt;&gt; Pricing: Forward Create Quote Request</w:t>
+              <w:br/>
+              <w:t xml:space="preserve">    Pricing -&gt;&gt; Pricing: Calculate Haversine distance &amp; duration</w:t>
+              <w:br/>
+              <w:t xml:space="preserve">    Pricing -&gt;&gt; Pricing: Query Active PricingRule (Base, km, min)</w:t>
+              <w:br/>
+              <w:t xml:space="preserve">    Pricing -&gt;&gt; Pricing: Calculate Surge Multiplier (Demand vs Supply)</w:t>
+              <w:br/>
+              <w:t xml:space="preserve">    Pricing -&gt;&gt; Pricing: Final Fare = (Base + Dist + Dur) * Surge</w:t>
+              <w:br/>
+              <w:t xml:space="preserve">    Pricing -&gt;&gt; DB: INSERT INTO pricing.fare_quotes (expires_at = NOW + 10m)</w:t>
+              <w:br/>
+              <w:t xml:space="preserve">    Pricing --&gt;&gt; GW: FareQuoteResponse (quoteId, totalFare, distanceKm, expiresAt)</w:t>
+              <w:br/>
+              <w:t xml:space="preserve">    GW --&gt;&gt; Customer: 200 OK (Display Fare on UI)</w:t>
               <w:br/>
               <w:t xml:space="preserve">    Note over Customer, Trip: Khách hàng xem giá và bấm nút "Xác nhận đặt xe"</w:t>
               <w:br/>
-              <w:t xml:space="preserve">    Customer-&gt;&gt;GW: POST /api/v1/trips (quoteId, pickupAddress, dropoffAddress)</w:t>
-              <w:br/>
-              <w:t xml:space="preserve">    GW-&gt;&gt;Trip: Forward Create Trip</w:t>
-              <w:br/>
-              <w:t xml:space="preserve">    Trip-&gt;&gt;Pricing: OpenFeign validateQuote(quoteId, customerId)</w:t>
-              <w:br/>
-              <w:t xml:space="preserve">    Pricing-&gt;&gt;DB: Check quote exists, not expired, is_used = false</w:t>
-              <w:br/>
-              <w:t xml:space="preserve">    Pricing--&gt;&gt;Trip: Quote Valid (fare_amount confirmed)</w:t>
-              <w:br/>
-              <w:t xml:space="preserve">    Trip-&gt;&gt;DB: INSERT INTO trip.trips (status = 'SEARCHING', quote_snapshot)</w:t>
-              <w:br/>
-              <w:t xml:space="preserve">    Trip-&gt;&gt;DB: UPDATE pricing.fare_quotes SET is_used = true</w:t>
-              <w:br/>
-              <w:t xml:space="preserve">    Trip--&gt;&gt;GW: TripResponse (tripId, status: SEARCHING)</w:t>
-              <w:br/>
-              <w:t xml:space="preserve">    GW--&gt;&gt;Customer: 201 Created (Screen switches to Radar Searching)</w:t>
+              <w:t xml:space="preserve">    Customer -&gt;&gt; GW: POST /api/v1/trips (quoteId, pickupAddress, dropoffAddress)</w:t>
+              <w:br/>
+              <w:t xml:space="preserve">    GW -&gt;&gt; Trip: Forward Create Trip</w:t>
+              <w:br/>
+              <w:t xml:space="preserve">    Trip -&gt;&gt; Pricing: OpenFeign validateQuote(quoteId, customerId)</w:t>
+              <w:br/>
+              <w:t xml:space="preserve">    Pricing -&gt;&gt; DB: Check quote exists, not expired, is_used = false</w:t>
+              <w:br/>
+              <w:t xml:space="preserve">    Pricing --&gt;&gt; Trip: Quote Valid (fare_amount confirmed)</w:t>
+              <w:br/>
+              <w:t xml:space="preserve">    Trip -&gt;&gt; DB: INSERT INTO trip.trips (status = 'SEARCHING', quote_snapshot)</w:t>
+              <w:br/>
+              <w:t xml:space="preserve">    Trip -&gt;&gt; DB: UPDATE pricing.fare_quotes SET is_used = true</w:t>
+              <w:br/>
+              <w:t xml:space="preserve">    Trip --&gt;&gt; GW: TripResponse (tripId, status: SEARCHING)</w:t>
+              <w:br/>
+              <w:t xml:space="preserve">    GW --&gt;&gt; Customer: 201 Created (Screen switches to Radar Searching)</w:t>
             </w:r>
           </w:p>
         </w:tc>
@@ -2236,7 +2298,20 @@
           <w:color w:val="334155"/>
           <w:sz w:val="19"/>
         </w:rPr>
-        <w:t xml:space="preserve">Giải quyết triệt để vấn đề Race Condition và gán xe trùng lặp (BR-002, BR-003, CON-06, NFR-REL-003) thông qua </w:t>
+        <w:t>Giải quyết triệt để vấn đề Race Condition và gán xe trùng lặp (BR-002, BR-003, CON-06, NFR-REL-003) thông qua **Redis</w:t>
+      </w:r>
+    </w:p>
+    <w:p>
+      <w:pPr>
+        <w:spacing w:before="20" w:after="60"/>
+      </w:pPr>
+      <w:r>
+        <w:rPr>
+          <w:rFonts w:ascii="Arial" w:hAnsi="Arial"/>
+          <w:color w:val="334155"/>
+          <w:sz w:val="19"/>
+        </w:rPr>
+        <w:t>Distributed Lock</w:t>
       </w:r>
       <w:r>
         <w:rPr>
@@ -2244,7 +2319,7 @@
           <w:b/>
           <w:sz w:val="19"/>
         </w:rPr>
-        <w:t>Redis Distributed Lock</w:t>
+        <w:t xml:space="preserve"> và </w:t>
       </w:r>
       <w:r>
         <w:rPr>
@@ -2252,23 +2327,7 @@
           <w:color w:val="334155"/>
           <w:sz w:val="19"/>
         </w:rPr>
-        <w:t xml:space="preserve"> và </w:t>
-      </w:r>
-      <w:r>
-        <w:rPr>
-          <w:rFonts w:ascii="Arial" w:hAnsi="Arial"/>
-          <w:b/>
-          <w:sz w:val="19"/>
-        </w:rPr>
-        <w:t>Partial Unique Index</w:t>
-      </w:r>
-      <w:r>
-        <w:rPr>
-          <w:rFonts w:ascii="Arial" w:hAnsi="Arial"/>
-          <w:color w:val="334155"/>
-          <w:sz w:val="19"/>
-        </w:rPr>
-        <w:t>.</w:t>
+        <w:t>Partial Unique Index**.</w:t>
       </w:r>
     </w:p>
     <w:tbl>
@@ -2334,62 +2393,60 @@
               <w:br/>
               <w:t xml:space="preserve">    participant DB as 🐘 PostgreSQL (trip.trips)</w:t>
               <w:br/>
-              <w:br/>
               <w:t xml:space="preserve">    Note over Trip, Location: Trip Service khởi động thuật toán tìm tài xế</w:t>
               <w:br/>
-              <w:t xml:space="preserve">    Trip-&gt;&gt;Location: OpenFeign getNearbyDrivers(pickupLat, pickupLng, radius=3km)</w:t>
-              <w:br/>
-              <w:t xml:space="preserve">    Location-&gt;&gt;Redis: GEORADIUS driver:locations:geo lat lng 3km</w:t>
-              <w:br/>
-              <w:t xml:space="preserve">    Redis--&gt;&gt;Location: List candidate driverIds [Driver1, Driver2]</w:t>
-              <w:br/>
-              <w:t xml:space="preserve">    Location--&gt;&gt;Trip: Candidates with distance &amp; ETA</w:t>
-              <w:br/>
-              <w:t xml:space="preserve">    Trip-&gt;&gt;Trip: Rank candidates (Distance -&gt; Rating -&gt; Acceptance Rate)</w:t>
-              <w:br/>
-              <w:t xml:space="preserve">    Trip-&gt;&gt;Trip: Create Driver Offers in DB (expires_at = NOW + 15s)</w:t>
-              <w:br/>
-              <w:t xml:space="preserve">    Trip--&gt;&gt;Driver1: WebSocket Push /user/queue/offers (Trip details, 15s countdown)</w:t>
-              <w:br/>
-              <w:t xml:space="preserve">    Trip--&gt;&gt;Driver2: WebSocket Push /user/queue/offers (Trip details, 15s countdown)</w:t>
-              <w:br/>
+              <w:t xml:space="preserve">    Trip -&gt;&gt; Location: OpenFeign getNearbyDrivers(pickupLat, pickupLng, radius=3km)</w:t>
+              <w:br/>
+              <w:t xml:space="preserve">    Location -&gt;&gt; Redis: GEORADIUS driver:locations:geo lat lng 3km</w:t>
+              <w:br/>
+              <w:t xml:space="preserve">    Redis --&gt;&gt; Location: List candidate driverIds [Driver1, Driver2]</w:t>
+              <w:br/>
+              <w:t xml:space="preserve">    Location --&gt;&gt; Trip: Candidates with distance &amp; ETA</w:t>
+              <w:br/>
+              <w:t xml:space="preserve">    Trip -&gt;&gt; Trip: Rank candidates (Distance -&gt; Rating -&gt; Acceptance Rate)</w:t>
+              <w:br/>
+              <w:t xml:space="preserve">    Trip -&gt;&gt; Trip: Create Driver Offers in DB (expires_at = NOW + 15s)</w:t>
+              <w:br/>
+              <w:t xml:space="preserve">    Trip --&gt;&gt; Driver1: WebSocket Push /user/queue/offers (Trip details, 15s countdown)</w:t>
+              <w:br/>
+              <w:t xml:space="preserve">    Trip --&gt;&gt; Driver2: WebSocket Push /user/queue/offers (Trip details, 15s countdown)</w:t>
               <w:br/>
               <w:t xml:space="preserve">    Note over Driver1, Driver2: Cả 2 tài xế cùng bấm nút "Nhận chuyến" cùng lúc (Tranh chấp)</w:t>
               <w:br/>
               <w:t xml:space="preserve">    par Driver 1 bấm nhận cuốc</w:t>
               <w:br/>
-              <w:t xml:space="preserve">        Driver1-&gt;&gt;Trip: POST /api/v1/trips/offers/{id}/accept</w:t>
-              <w:br/>
-              <w:t xml:space="preserve">        Trip-&gt;&gt;Redis: Acquire Lock "lock:trip:{tripId}" (Redisson TTL 5s)</w:t>
+              <w:t xml:space="preserve">        Driver1 -&gt;&gt; Trip: POST /api/v1/trips/offers/{id}/accept</w:t>
+              <w:br/>
+              <w:t xml:space="preserve">        Trip -&gt;&gt; Redis: Acquire Lock "lock:trip:{tripId}" (Redisson TTL 5s)</w:t>
               <w:br/>
               <w:t xml:space="preserve">        Note over Trip, Redis: Driver 1 LẤY ĐƯỢC LOCK THÀNH CÔNG</w:t>
               <w:br/>
-              <w:t xml:space="preserve">        Trip-&gt;&gt;Redis: Acquire Lock "lock:driver:{driver1Id}" (Success)</w:t>
-              <w:br/>
-              <w:t xml:space="preserve">        Trip-&gt;&gt;DB: UPDATE trip.trips SET driver_id = Driver1, status = 'ACCEPTED'\n(Guarded by Partial Unique Index)</w:t>
-              <w:br/>
-              <w:t xml:space="preserve">        Trip-&gt;&gt;DB: UPDATE trip.driver_offers SET status = 'ACCEPTED' WHERE id = offer1</w:t>
-              <w:br/>
-              <w:t xml:space="preserve">        Trip-&gt;&gt;DB: UPDATE trip.driver_offers SET status = 'CANCELLED' WHERE trip_id = tripId AND id != offer1</w:t>
-              <w:br/>
-              <w:t xml:space="preserve">        Trip-&gt;&gt;Redis: Release Locks</w:t>
-              <w:br/>
-              <w:t xml:space="preserve">        Trip--&gt;&gt;Driver1: 200 OK (Thành công - Chuyển sang màn hình Đón khách)</w:t>
+              <w:t xml:space="preserve">        Trip -&gt;&gt; Redis: Acquire Lock "lock:driver:{driver1Id}" (Success)</w:t>
+              <w:br/>
+              <w:t xml:space="preserve">        Trip -&gt;&gt; DB: UPDATE trip.trips SET driver_id = Driver1, status = 'ACCEPTED'\n(Guarded by Partial Unique Index)</w:t>
+              <w:br/>
+              <w:t xml:space="preserve">        Trip -&gt;&gt; DB: UPDATE trip.driver_offers SET status = 'ACCEPTED' WHERE id = offer1</w:t>
+              <w:br/>
+              <w:t xml:space="preserve">        Trip -&gt;&gt; DB: UPDATE trip.driver_offers SET status = 'CANCELLED' WHERE trip_id = tripId AND id != offer1</w:t>
+              <w:br/>
+              <w:t xml:space="preserve">        Trip -&gt;&gt; Redis: Release Locks</w:t>
+              <w:br/>
+              <w:t xml:space="preserve">        Trip --&gt;&gt; Driver1: 200 OK (Thành công - Chuyển sang màn hình Đón khách)</w:t>
               <w:br/>
               <w:t xml:space="preserve">    and Driver 2 bấm nhận cuốc (Trễ mili-giây)</w:t>
               <w:br/>
-              <w:t xml:space="preserve">        Driver2-&gt;&gt;Trip: POST /api/v1/trips/offers/{id}/accept</w:t>
-              <w:br/>
-              <w:t xml:space="preserve">        Trip-&gt;&gt;Redis: Acquire Lock "lock:trip:{tripId}"</w:t>
+              <w:t xml:space="preserve">        Driver2 -&gt;&gt; Trip: POST /api/v1/trips/offers/{id}/accept</w:t>
+              <w:br/>
+              <w:t xml:space="preserve">        Trip -&gt;&gt; Redis: Acquire Lock "lock:trip:{tripId}"</w:t>
               <w:br/>
               <w:t xml:space="preserve">        Note over Trip, Redis: BỊ CHẶN: Lock đã bị Driver 1 chiếm giữ hoặc Offer đã CANCELLED</w:t>
               <w:br/>
-              <w:t xml:space="preserve">        Trip--&gt;&gt;Driver2: 409 Conflict / BusinessException ("TRIP_ALREADY_ASSIGNED")</w:t>
+              <w:t xml:space="preserve">        Trip --&gt;&gt; Driver2: 409 Conflict / BusinessException ("TRIP_ALREADY_ASSIGNED")</w:t>
               <w:br/>
               <w:t xml:space="preserve">    end</w:t>
               <w:br/>
               <w:br/>
-              <w:t xml:space="preserve">    Trip--&gt;&gt;Driver2: WebSocket /topic/trip: Offer has been cancelled</w:t>
+              <w:t xml:space="preserve">    Trip --&gt;&gt; Driver2: WebSocket /topic/trip: Offer has been cancelled</w:t>
             </w:r>
           </w:p>
         </w:tc>
@@ -2501,30 +2558,28 @@
               <w:br/>
               <w:t xml:space="preserve">    actor Customer as 📱 Customer App (Live Tracking)</w:t>
               <w:br/>
-              <w:br/>
               <w:t xml:space="preserve">    Note over Driver, WS: Driver gửi GPS định kỳ mỗi 3 giây</w:t>
               <w:br/>
-              <w:t xml:space="preserve">    Driver-&gt;&gt;WS: SEND /app/telemetry (lat, lng, speed, heading, timestamp)</w:t>
-              <w:br/>
-              <w:t xml:space="preserve">    WS-&gt;&gt;WS: Validate Coordinates &amp; Accuracy (&lt;= 50m)</w:t>
-              <w:br/>
-              <w:t xml:space="preserve">    WS-&gt;&gt;WS: Check Sequence: deviceTimestamp &gt; lastTimestamp</w:t>
-              <w:br/>
-              <w:t xml:space="preserve">    </w:t>
+              <w:t xml:space="preserve">    Driver -&gt;&gt; WS: SEND /app/telemetry (lat, lng, speed, heading, timestamp)</w:t>
+              <w:br/>
+              <w:t xml:space="preserve">    WS -&gt;&gt; WS: Validate Coordinates &amp; Accuracy (&lt;= 50m)</w:t>
+              <w:br/>
+              <w:t xml:space="preserve">    WS -&gt;&gt; WS: Check Sequence: deviceTimestamp &gt; lastTimestamp</w:t>
+              <w:br/>
               <w:br/>
               <w:t xml:space="preserve">    par Cache vào Redis (Cực nhanh)</w:t>
               <w:br/>
-              <w:t xml:space="preserve">        WS-&gt;&gt;Redis: GEOADD driver:locations:geo lng lat driverId</w:t>
-              <w:br/>
-              <w:t xml:space="preserve">        WS-&gt;&gt;Redis: SET driver:location:{driverId} JSON_DATA (EXPIRE 60s)</w:t>
+              <w:t xml:space="preserve">        WS -&gt;&gt; Redis: GEOADD driver:locations:geo lng lat driverId</w:t>
+              <w:br/>
+              <w:t xml:space="preserve">        WS -&gt;&gt; Redis: SET driver:location:{driverId} JSON_DATA (EXPIRE 60s)</w:t>
               <w:br/>
               <w:t xml:space="preserve">    and Phát sóng trực tiếp tới Khách hàng</w:t>
               <w:br/>
-              <w:t xml:space="preserve">        WS-&gt;&gt;Customer: STOMP Broadcast /topic/trip/{tripId}/location\n(lat, lng, heading, speed, etaMinutes)</w:t>
+              <w:t xml:space="preserve">        WS -&gt;&gt; Customer: STOMP Broadcast /topic/trip/{tripId}/location\n(lat, lng, heading, speed, etaMinutes)</w:t>
               <w:br/>
               <w:t xml:space="preserve">    and Lưu lịch sử bất đồng bộ vào DB</w:t>
               <w:br/>
-              <w:t xml:space="preserve">        WS-)DB: Async Batch Insert location.driver_telemetry_history\n(geom = ST_SetSRID(ST_MakePoint(lng, lat), 4326))</w:t>
+              <w:t xml:space="preserve">        WS -) DB: Async Batch Insert location.driver_telemetry_history\n(geom = ST_SetSRID(ST_MakePoint(lng, lat), 4326))</w:t>
               <w:br/>
               <w:t xml:space="preserve">    end</w:t>
             </w:r>
@@ -2606,7 +2661,19 @@
           <w:color w:val="334155"/>
           <w:sz w:val="19"/>
         </w:rPr>
-        <w:t xml:space="preserve">, và hạch toán ví tài xế theo mô hình </w:t>
+        <w:t>, và hạch toán ví tài xế theo mô hình</w:t>
+      </w:r>
+    </w:p>
+    <w:p>
+      <w:pPr>
+        <w:spacing w:before="20" w:after="60"/>
+      </w:pPr>
+      <w:r>
+        <w:rPr>
+          <w:rFonts w:ascii="Arial" w:hAnsi="Arial"/>
+          <w:color w:val="334155"/>
+          <w:sz w:val="19"/>
+        </w:rPr>
       </w:r>
       <w:r>
         <w:rPr>
@@ -2686,51 +2753,43 @@
               <w:br/>
               <w:t xml:space="preserve">    participant DB as 🐘 PostgreSQL (billing.wallets &amp; entries)</w:t>
               <w:br/>
-              <w:br/>
-              <w:t xml:space="preserve">    Driver-&gt;&gt;Trip: PUT /api/v1/trips/{id}/complete</w:t>
-              <w:br/>
-              <w:t xml:space="preserve">    Trip-&gt;&gt;Trip: Validate state transition: IN_PROGRESS -&gt; COMPLETED</w:t>
-              <w:br/>
-              <w:t xml:space="preserve">    Trip-&gt;&gt;Trip: Set completed_at = NOW()</w:t>
-              <w:br/>
-              <w:t xml:space="preserve">    Trip-&gt;&gt;DB: UPDATE trip.trips SET status = 'COMPLETED'</w:t>
-              <w:br/>
-              <w:t xml:space="preserve">    Trip-&gt;&gt;DB: INSERT INTO platform.outbox_events\n(event_type: 'TRIP_COMPLETED', payload: TripCompletedEvent)</w:t>
-              <w:br/>
-              <w:t xml:space="preserve">    Trip--&gt;&gt;Driver: 200 OK (Chuyến xe đã kết thúc)</w:t>
-              <w:br/>
+              <w:t xml:space="preserve">    Driver -&gt;&gt; Trip: PUT /api/v1/trips/{id}/complete</w:t>
+              <w:br/>
+              <w:t xml:space="preserve">    Trip -&gt;&gt; Trip: Validate state transition: IN_PROGRESS -&gt; COMPLETED</w:t>
+              <w:br/>
+              <w:t xml:space="preserve">    Trip -&gt;&gt; Trip: Set completed_at = NOW()</w:t>
+              <w:br/>
+              <w:t xml:space="preserve">    Trip -&gt;&gt; DB: UPDATE trip.trips SET status = 'COMPLETED'</w:t>
+              <w:br/>
+              <w:t xml:space="preserve">    Trip -&gt;&gt; DB: INSERT INTO platform.outbox_events\n(event_type: 'TRIP_COMPLETED', payload: TripCompletedEvent)</w:t>
+              <w:br/>
+              <w:t xml:space="preserve">    Trip --&gt;&gt; Driver: 200 OK (Chuyến xe đã kết thúc)</w:t>
               <w:br/>
               <w:t xml:space="preserve">    Note over Trip, Kafka: Outbox Publisher đẩy sự kiện vào Kafka Broker</w:t>
               <w:br/>
-              <w:t xml:space="preserve">    Trip-)Kafka: Publish TripCompletedEvent (tripId, customerId, driverId, fareAmount=100.000, CASH)</w:t>
-              <w:br/>
-              <w:t xml:space="preserve">    </w:t>
-              <w:br/>
-              <w:t xml:space="preserve">    Kafka-)Payment: TripCompletedConsumer receives message</w:t>
-              <w:br/>
-              <w:t xml:space="preserve">    Payment-&gt;&gt;Payment: Check Idempotency: platform.idempotency_keys</w:t>
-              <w:br/>
-              <w:t xml:space="preserve">    Payment-&gt;&gt;DB: INSERT INTO billing.payments (trip_id, amount=100.000, method='CASH', status='SUCCESS')</w:t>
-              <w:br/>
-              <w:t xml:space="preserve">    </w:t>
+              <w:t xml:space="preserve">    Trip -) Kafka: Publish TripCompletedEvent (tripId, customerId, driverId, fareAmount=100.000, CASH)</w:t>
+              <w:br/>
+              <w:t xml:space="preserve">    Kafka -) Payment: TripCompletedConsumer receives message</w:t>
+              <w:br/>
+              <w:t xml:space="preserve">    Payment -&gt;&gt; Payment: Check Idempotency: platform.idempotency_keys</w:t>
+              <w:br/>
+              <w:t xml:space="preserve">    Payment -&gt;&gt; DB: INSERT INTO billing.payments (trip_id, amount=100.000, method='CASH', status='SUCCESS')</w:t>
               <w:br/>
               <w:t xml:space="preserve">    Note over Payment, DB: Hạch toán Ví Tài Xế theo Bút toán Kế toán Kép Bất biến</w:t>
               <w:br/>
-              <w:t xml:space="preserve">    Payment-&gt;&gt;DB: SELECT * FROM billing.wallets WHERE driver_id = driverId FOR UPDATE</w:t>
+              <w:t xml:space="preserve">    Payment -&gt;&gt; DB: SELECT * FROM billing.wallets WHERE driver_id = driverId FOR UPDATE</w:t>
               <w:br/>
               <w:t xml:space="preserve">    Note over Payment: Chuyến tiền mặt: Tài xế đã cầm 100k tiền mặt của khách\nCông ty trừ 20% phí hoa hồng (20.000 VNĐ) vào ví tài xế</w:t>
               <w:br/>
-              <w:t xml:space="preserve">    Payment-&gt;&gt;Payment: NewBalance = Balance - 20.000 VNĐ (Phải &gt;= 0)</w:t>
-              <w:br/>
-              <w:t xml:space="preserve">    Payment-&gt;&gt;DB: UPDATE billing.wallets SET balance = NewBalance</w:t>
-              <w:br/>
-              <w:t xml:space="preserve">    Payment-&gt;&gt;DB: INSERT INTO billing.wallet_entries\n(wallet_id, entry_type='DEBIT', amount=20.000, balance_after=NewBalance,\ndescription='Platform commission fee 20% for trip {tripId}')</w:t>
-              <w:br/>
-              <w:t xml:space="preserve">    </w:t>
-              <w:br/>
-              <w:t xml:space="preserve">    Payment-&gt;&gt;DB: INSERT INTO platform.idempotency_keys (key: 'EVENT_TRIP_COMPLETED_{tripId}')</w:t>
-              <w:br/>
-              <w:t xml:space="preserve">    Payment--&gt;&gt;Kafka: Acknowledge Offset (Commit)</w:t>
+              <w:t xml:space="preserve">    Payment -&gt;&gt; Payment: NewBalance = Balance - 20.000 VNĐ (Phải &gt;= 0)</w:t>
+              <w:br/>
+              <w:t xml:space="preserve">    Payment -&gt;&gt; DB: UPDATE billing.wallets SET balance = NewBalance</w:t>
+              <w:br/>
+              <w:t xml:space="preserve">    Payment -&gt;&gt; DB: INSERT INTO billing.wallet_entries\n(wallet_id, entry_type='DEBIT', amount=20.000, balance_after=NewBalance,\ndescription='Platform commission fee 20% for trip {tripId}')</w:t>
+              <w:br/>
+              <w:t xml:space="preserve">    Payment -&gt;&gt; DB: INSERT INTO platform.idempotency_keys (key: 'EVENT_TRIP_COMPLETED_{tripId}')</w:t>
+              <w:br/>
+              <w:t xml:space="preserve">    Payment --&gt;&gt; Kafka: Acknowledge Offset (Commit)</w:t>
             </w:r>
           </w:p>
         </w:tc>
@@ -2778,7 +2837,32 @@
           <w:color w:val="334155"/>
           <w:sz w:val="19"/>
         </w:rPr>
-        <w:t xml:space="preserve">Mọi thao tác thay đổi trạng thái cuốc xe bắt buộc phải tuân theo sơ đồ chuyển đổi trạng thái (State Transition Model). Bất kỳ lệnh chuyển trạng thái nào nằm ngoài luồng định nghĩa đều lập tức bị từ chối bằng </w:t>
+        <w:t>Mọi thao tác thay đổi trạng thái cuốc xe bắt buộc phải tuân theo sơ đồ chuyển đổi trạng thái (State Transition Model).</w:t>
+      </w:r>
+    </w:p>
+    <w:p>
+      <w:pPr>
+        <w:spacing w:before="20" w:after="60"/>
+      </w:pPr>
+      <w:r>
+        <w:rPr>
+          <w:rFonts w:ascii="Arial" w:hAnsi="Arial"/>
+          <w:color w:val="334155"/>
+          <w:sz w:val="19"/>
+        </w:rPr>
+        <w:t>Bất kỳ lệnh chuyển trạng thái nào nằm ngoài luồng định nghĩa đều lập tức bị từ chối bằng</w:t>
+      </w:r>
+    </w:p>
+    <w:p>
+      <w:pPr>
+        <w:spacing w:before="20" w:after="60"/>
+      </w:pPr>
+      <w:r>
+        <w:rPr>
+          <w:rFonts w:ascii="Arial" w:hAnsi="Arial"/>
+          <w:color w:val="334155"/>
+          <w:sz w:val="19"/>
+        </w:rPr>
       </w:r>
       <w:r>
         <w:rPr>
@@ -2846,49 +2930,37 @@
               </w:rPr>
               <w:t>stateDiagram-v2</w:t>
               <w:br/>
-              <w:t xml:space="preserve">    [*] --&gt; DRAFT : Khách hàng tạo yêu cầu từ Fare Quote</w:t>
-              <w:br/>
-              <w:t xml:space="preserve">    DRAFT --&gt; SEARCHING : Khởi động Dispatch tìm tài xế gần</w:t>
-              <w:br/>
-              <w:t xml:space="preserve">    </w:t>
-              <w:br/>
-              <w:t xml:space="preserve">    SEARCHING --&gt; OFFERED : Tìm thấy ứng viên, gửi Offer (Hạn 15s)</w:t>
-              <w:br/>
-              <w:t xml:space="preserve">    SEARCHING --&gt; CANCELLED : Khách hàng bấm hủy khi đang tìm (Miễn phí)</w:t>
-              <w:br/>
-              <w:t xml:space="preserve">    SEARCHING --&gt; NO_DRIVER_FOUND : Hết thời gian tìm kiếm tối đa (3 phút)</w:t>
-              <w:br/>
-              <w:t xml:space="preserve">    </w:t>
-              <w:br/>
-              <w:t xml:space="preserve">    OFFERED --&gt; ACCEPTED : Tài xế bấm nhận cuốc (Redis Lock thành công)</w:t>
-              <w:br/>
-              <w:t xml:space="preserve">    OFFERED --&gt; SEARCHING : Tài xế từ chối (REJECT) hoặc hết hạn (EXPIRED) 15s</w:t>
-              <w:br/>
-              <w:t xml:space="preserve">    OFFERED --&gt; CANCELLED : Khách hàng bấm hủy chuyến</w:t>
-              <w:br/>
-              <w:t xml:space="preserve">    </w:t>
-              <w:br/>
-              <w:t xml:space="preserve">    ACCEPTED --&gt; ARRIVING : Tài xế di chuyển tới điểm đón</w:t>
-              <w:br/>
-              <w:t xml:space="preserve">    ACCEPTED --&gt; CANCELLED : Khách/Tài xế hủy (Tính phí phạt nếu vi phạm)</w:t>
-              <w:br/>
-              <w:t xml:space="preserve">    </w:t>
-              <w:br/>
-              <w:t xml:space="preserve">    ARRIVING --&gt; IN_PROGRESS : Khách lên xe, tài xế bấm "Bắt đầu hành trình"</w:t>
-              <w:br/>
-              <w:t xml:space="preserve">    ARRIVING --&gt; CANCELLED : Khách không xuất hiện (No-show &gt; 5 phút)</w:t>
-              <w:br/>
-              <w:t xml:space="preserve">    </w:t>
-              <w:br/>
-              <w:t xml:space="preserve">    IN_PROGRESS --&gt; COMPLETED : Đến điểm trả, tài xế bấm "Hoàn tất chuyến"</w:t>
-              <w:br/>
-              <w:t xml:space="preserve">    </w:t>
-              <w:br/>
-              <w:t xml:space="preserve">    COMPLETED --&gt; [*] : Kích hoạt thanh toán, đối soát ví</w:t>
-              <w:br/>
-              <w:t xml:space="preserve">    CANCELLED --&gt; [*] : Giải phóng tài xế, tính phí phạt nếu có</w:t>
-              <w:br/>
-              <w:t xml:space="preserve">    NO_DRIVER_FOUND --&gt; [*] : Kết thúc phiên tìm kiếm</w:t>
+              <w:t xml:space="preserve">    [*] --&gt; DRAFT: Khách hàng tạo yêu cầu từ Fare Quote</w:t>
+              <w:br/>
+              <w:t xml:space="preserve">    DRAFT --&gt; SEARCHING: Khởi động Dispatch tìm tài xế gần</w:t>
+              <w:br/>
+              <w:t xml:space="preserve">    SEARCHING --&gt; OFFERED: Tìm thấy ứng viên, gửi Offer (Hạn 15s)</w:t>
+              <w:br/>
+              <w:t xml:space="preserve">    SEARCHING --&gt; CANCELLED: Khách hàng bấm hủy khi đang tìm (Miễn phí)</w:t>
+              <w:br/>
+              <w:t xml:space="preserve">    SEARCHING --&gt; NO_DRIVER_FOUND: Hết thời gian tìm kiếm tối đa (3 phút)</w:t>
+              <w:br/>
+              <w:t xml:space="preserve">    OFFERED --&gt; ACCEPTED: Tài xế bấm nhận cuốc (Redis Lock thành công)</w:t>
+              <w:br/>
+              <w:t xml:space="preserve">    OFFERED --&gt; SEARCHING: Tài xế từ chối (REJECT) hoặc hết hạn (EXPIRED) 15s</w:t>
+              <w:br/>
+              <w:t xml:space="preserve">    OFFERED --&gt; CANCELLED: Khách hàng bấm hủy chuyến</w:t>
+              <w:br/>
+              <w:t xml:space="preserve">    ACCEPTED --&gt; ARRIVING: Tài xế di chuyển tới điểm đón</w:t>
+              <w:br/>
+              <w:t xml:space="preserve">    ACCEPTED --&gt; CANCELLED: Khách/Tài xế hủy (Tính phí phạt nếu vi phạm)</w:t>
+              <w:br/>
+              <w:t xml:space="preserve">    ARRIVING --&gt; IN_PROGRESS: Khách lên xe, tài xế bấm "Bắt đầu hành trình"</w:t>
+              <w:br/>
+              <w:t xml:space="preserve">    ARRIVING --&gt; CANCELLED: Khách không xuất hiện (No-show &gt; 5 phút)</w:t>
+              <w:br/>
+              <w:t xml:space="preserve">    IN_PROGRESS --&gt; COMPLETED: Đến điểm trả, tài xế bấm "Hoàn tất chuyến"</w:t>
+              <w:br/>
+              <w:t xml:space="preserve">    COMPLETED --&gt; [*]: Kích hoạt thanh toán, đối soát ví</w:t>
+              <w:br/>
+              <w:t xml:space="preserve">    CANCELLED --&gt; [*]: Giải phóng tài xế, tính phí phạt nếu có</w:t>
+              <w:br/>
+              <w:t xml:space="preserve">    NO_DRIVER_FOUND --&gt; [*]: Kết thúc phiên tìm kiếm</w:t>
             </w:r>
           </w:p>
         </w:tc>
@@ -2979,7 +3051,20 @@
           <w:color w:val="334155"/>
           <w:sz w:val="19"/>
         </w:rPr>
-        <w:t xml:space="preserve"> Điểm truy cập duy nhất (Single Point of Entry), định tuyến ngược (Reverse Proxy), xác thực Stateless JWT, lọc CORS, Rate Limiting Token Bucket.</w:t>
+        <w:t xml:space="preserve"> Điểm truy cập duy nhất (Single Point of Entry), định tuyến ngược (Reverse Proxy), xác thực Stateless</w:t>
+      </w:r>
+    </w:p>
+    <w:p>
+      <w:pPr>
+        <w:spacing w:before="20" w:after="60"/>
+      </w:pPr>
+      <w:r>
+        <w:rPr>
+          <w:rFonts w:ascii="Arial" w:hAnsi="Arial"/>
+          <w:color w:val="334155"/>
+          <w:sz w:val="19"/>
+        </w:rPr>
+        <w:t>JWT, lọc CORS, Rate Limiting Token Bucket.</w:t>
       </w:r>
     </w:p>
     <w:p>
@@ -4157,7 +4242,20 @@
           <w:color w:val="334155"/>
           <w:sz w:val="19"/>
         </w:rPr>
-        <w:t xml:space="preserve"> Quản lý vòng đời hồ sơ tài xế (DRAFT -&gt; APPROVED), thông tin phương tiện, tải lên giấy tờ (CCCD, GPLX), trạng thái khả dụng (AVAILABLE, BUSY, OFFLINE).</w:t>
+        <w:t xml:space="preserve"> Quản lý vòng đời hồ sơ tài xế (DRAFT -&gt; APPROVED), thông tin phương tiện, tải lên giấy tờ (CCCD, GPLX),</w:t>
+      </w:r>
+    </w:p>
+    <w:p>
+      <w:pPr>
+        <w:spacing w:before="20" w:after="60"/>
+      </w:pPr>
+      <w:r>
+        <w:rPr>
+          <w:rFonts w:ascii="Arial" w:hAnsi="Arial"/>
+          <w:color w:val="334155"/>
+          <w:sz w:val="19"/>
+        </w:rPr>
+        <w:t>trạng thái khả dụng (AVAILABLE, BUSY, OFFLINE).</w:t>
       </w:r>
     </w:p>
     <w:p>
@@ -4953,7 +5051,20 @@
           <w:color w:val="334155"/>
           <w:sz w:val="19"/>
         </w:rPr>
-        <w:t xml:space="preserve"> Tiếp nhận tọa độ telemetry GPS, định vị không gian Redis GEO, đồng bộ PostGIS, tìm tài xế gần điểm đón, WebSocket live broadcast.</w:t>
+        <w:t xml:space="preserve"> Tiếp nhận tọa độ telemetry GPS, định vị không gian Redis GEO, đồng bộ PostGIS, tìm tài xế gần điểm đón,</w:t>
+      </w:r>
+    </w:p>
+    <w:p>
+      <w:pPr>
+        <w:spacing w:before="20" w:after="60"/>
+      </w:pPr>
+      <w:r>
+        <w:rPr>
+          <w:rFonts w:ascii="Arial" w:hAnsi="Arial"/>
+          <w:color w:val="334155"/>
+          <w:sz w:val="19"/>
+        </w:rPr>
+        <w:t>WebSocket live broadcast.</w:t>
       </w:r>
     </w:p>
     <w:p>
@@ -5374,99 +5485,8 @@
         <w:tc>
           <w:tcPr>
             <w:tcW w:type="dxa" w:w="2484"/>
-            <w:shd w:val="clear" w:color="auto" w:fill="FFFFFF"/>
           </w:tcPr>
-          <w:p>
-            <w:pPr>
-              <w:spacing w:before="40" w:after="40"/>
-            </w:pPr>
-            <w:r>
-              <w:rPr>
-                <w:rFonts w:ascii="Arial" w:hAnsi="Arial"/>
-                <w:color w:val="1E293B"/>
-                <w:sz w:val="17"/>
-              </w:rPr>
-              <w:t>Lấy tọa độ toàn bộ tài xế đang online phục vụ bản đồ nhiệt</w:t>
-            </w:r>
-          </w:p>
-        </w:tc>
-      </w:tr>
-      <w:tr>
-        <w:tc>
-          <w:tcPr>
-            <w:tcW w:type="dxa" w:w="2484"/>
-            <w:shd w:val="clear" w:color="auto" w:fill="F8FAFC"/>
-          </w:tcPr>
-          <w:p>
-            <w:pPr>
-              <w:spacing w:before="40" w:after="40"/>
-            </w:pPr>
-            <w:r>
-              <w:rPr>
-                <w:rFonts w:ascii="Arial" w:hAnsi="Arial"/>
-                <w:color w:val="1E293B"/>
-                <w:sz w:val="17"/>
-              </w:rPr>
-              <w:t>`WS`</w:t>
-            </w:r>
-          </w:p>
-        </w:tc>
-        <w:tc>
-          <w:tcPr>
-            <w:tcW w:type="dxa" w:w="2484"/>
-            <w:shd w:val="clear" w:color="auto" w:fill="F8FAFC"/>
-          </w:tcPr>
-          <w:p>
-            <w:pPr>
-              <w:spacing w:before="40" w:after="40"/>
-            </w:pPr>
-            <w:r>
-              <w:rPr>
-                <w:rFonts w:ascii="Arial" w:hAnsi="Arial"/>
-                <w:color w:val="1E293B"/>
-                <w:sz w:val="17"/>
-              </w:rPr>
-              <w:t>`/ws/telemetry`</w:t>
-            </w:r>
-          </w:p>
-        </w:tc>
-        <w:tc>
-          <w:tcPr>
-            <w:tcW w:type="dxa" w:w="2484"/>
-            <w:shd w:val="clear" w:color="auto" w:fill="F8FAFC"/>
-          </w:tcPr>
-          <w:p>
-            <w:pPr>
-              <w:spacing w:before="40" w:after="40"/>
-            </w:pPr>
-            <w:r>
-              <w:rPr>
-                <w:rFonts w:ascii="Arial" w:hAnsi="Arial"/>
-                <w:color w:val="1E293B"/>
-                <w:sz w:val="17"/>
-              </w:rPr>
-              <w:t>Authenticated</w:t>
-            </w:r>
-          </w:p>
-        </w:tc>
-        <w:tc>
-          <w:tcPr>
-            <w:tcW w:type="dxa" w:w="2484"/>
-            <w:shd w:val="clear" w:color="auto" w:fill="F8FAFC"/>
-          </w:tcPr>
-          <w:p>
-            <w:pPr>
-              <w:spacing w:before="40" w:after="40"/>
-            </w:pPr>
-            <w:r>
-              <w:rPr>
-                <w:rFonts w:ascii="Arial" w:hAnsi="Arial"/>
-                <w:color w:val="1E293B"/>
-                <w:sz w:val="17"/>
-              </w:rPr>
-              <w:t>Kênh WebSocket STOMP truyền tọa độ thời gian thực</w:t>
-            </w:r>
-          </w:p>
+          <w:p/>
         </w:tc>
       </w:tr>
     </w:tbl>
@@ -5474,6 +5494,64 @@
       <w:pPr>
         <w:spacing w:before="40" w:after="80"/>
       </w:pPr>
+    </w:p>
+    <w:p>
+      <w:pPr>
+        <w:spacing w:before="20" w:after="60"/>
+      </w:pPr>
+      <w:r>
+        <w:rPr>
+          <w:rFonts w:ascii="Arial" w:hAnsi="Arial"/>
+          <w:color w:val="334155"/>
+          <w:sz w:val="19"/>
+        </w:rPr>
+        <w:t>nhiệt |</w:t>
+      </w:r>
+    </w:p>
+    <w:p>
+      <w:pPr>
+        <w:spacing w:before="20" w:after="60"/>
+      </w:pPr>
+      <w:r>
+        <w:rPr>
+          <w:rFonts w:ascii="Arial" w:hAnsi="Arial"/>
+          <w:color w:val="334155"/>
+          <w:sz w:val="19"/>
+        </w:rPr>
+        <w:t xml:space="preserve">| </w:t>
+      </w:r>
+      <w:r>
+        <w:rPr>
+          <w:rFonts w:ascii="Consolas" w:hAnsi="Consolas"/>
+          <w:color w:val="104B78"/>
+          <w:sz w:val="18"/>
+        </w:rPr>
+        <w:t>WS</w:t>
+      </w:r>
+      <w:r>
+        <w:rPr>
+          <w:rFonts w:ascii="Arial" w:hAnsi="Arial"/>
+          <w:color w:val="334155"/>
+          <w:sz w:val="19"/>
+        </w:rPr>
+        <w:t xml:space="preserve"> | </w:t>
+      </w:r>
+      <w:r>
+        <w:rPr>
+          <w:rFonts w:ascii="Consolas" w:hAnsi="Consolas"/>
+          <w:color w:val="104B78"/>
+          <w:sz w:val="18"/>
+        </w:rPr>
+        <w:t>/ws/telemetry</w:t>
+      </w:r>
+      <w:r>
+        <w:rPr>
+          <w:rFonts w:ascii="Arial" w:hAnsi="Arial"/>
+          <w:color w:val="334155"/>
+          <w:sz w:val="19"/>
+        </w:rPr>
+        <w:t xml:space="preserve"> | Authenticated | Kênh WebSocket STOMP truyền tọa độ thời gian thực |</w:t>
+      </w:r>
     </w:p>
     <w:p>
       <w:pPr>
@@ -5515,7 +5593,20 @@
           <w:color w:val="334155"/>
           <w:sz w:val="19"/>
         </w:rPr>
-        <w:t xml:space="preserve"> Động cơ định giá cước chuyến (Surge Engine), tính giá cơ sở, khoảng cách, thời gian, phụ phí đêm/cao điểm, sinh Fare Quote 10 phút.</w:t>
+        <w:t xml:space="preserve"> Động cơ định giá cước chuyến (Surge Engine), tính giá cơ sở, khoảng cách, thời gian, phụ phí đêm/cao</w:t>
+      </w:r>
+    </w:p>
+    <w:p>
+      <w:pPr>
+        <w:spacing w:before="20" w:after="60"/>
+      </w:pPr>
+      <w:r>
+        <w:rPr>
+          <w:rFonts w:ascii="Arial" w:hAnsi="Arial"/>
+          <w:color w:val="334155"/>
+          <w:sz w:val="19"/>
+        </w:rPr>
+        <w:t>điểm, sinh Fare Quote 10 phút.</w:t>
       </w:r>
     </w:p>
     <w:p>
@@ -5999,7 +6090,20 @@
           <w:color w:val="334155"/>
           <w:sz w:val="19"/>
         </w:rPr>
-        <w:t xml:space="preserve"> Quản lý vòng đời chuyến xe, thuật toán Dispatch, khóa phân tán nhận cuốc xe nguyên tử, hủy chuyến, phát sự kiện Kafka </w:t>
+        <w:t xml:space="preserve"> Quản lý vòng đời chuyến xe, thuật toán Dispatch, khóa phân tán nhận cuốc xe nguyên tử, hủy chuyến, phát</w:t>
+      </w:r>
+    </w:p>
+    <w:p>
+      <w:pPr>
+        <w:spacing w:before="20" w:after="60"/>
+      </w:pPr>
+      <w:r>
+        <w:rPr>
+          <w:rFonts w:ascii="Arial" w:hAnsi="Arial"/>
+          <w:color w:val="334155"/>
+          <w:sz w:val="19"/>
+        </w:rPr>
+        <w:t xml:space="preserve">sự kiện Kafka </w:t>
       </w:r>
       <w:r>
         <w:rPr>
@@ -6905,7 +7009,20 @@
           <w:color w:val="334155"/>
           <w:sz w:val="19"/>
         </w:rPr>
-        <w:t>, Sổ cái tài chính Ví tài xế Bất biến (Immutable Ledger), hoàn tiền.</w:t>
+        <w:t>, Sổ cái tài chính Ví tài xế Bất</w:t>
+      </w:r>
+    </w:p>
+    <w:p>
+      <w:pPr>
+        <w:spacing w:before="20" w:after="60"/>
+      </w:pPr>
+      <w:r>
+        <w:rPr>
+          <w:rFonts w:ascii="Arial" w:hAnsi="Arial"/>
+          <w:color w:val="334155"/>
+          <w:sz w:val="19"/>
+        </w:rPr>
+        <w:t>biến (Immutable Ledger), hoàn tiền.</w:t>
       </w:r>
     </w:p>
     <w:p>
@@ -7545,7 +7662,20 @@
           <w:color w:val="334155"/>
           <w:sz w:val="19"/>
         </w:rPr>
-        <w:t xml:space="preserve"> Quản lý danh bạ IP/Port của toàn bộ instances microservices, hỗ trợ tự phục hồi và tự động hủy đăng ký khi instance chết.</w:t>
+        <w:t xml:space="preserve"> Quản lý danh bạ IP/Port của toàn bộ instances microservices, hỗ trợ tự phục hồi và tự động hủy đăng</w:t>
+      </w:r>
+    </w:p>
+    <w:p>
+      <w:pPr>
+        <w:spacing w:before="20" w:after="60"/>
+      </w:pPr>
+      <w:r>
+        <w:rPr>
+          <w:rFonts w:ascii="Arial" w:hAnsi="Arial"/>
+          <w:color w:val="334155"/>
+          <w:sz w:val="19"/>
+        </w:rPr>
+        <w:t>ký khi instance chết.</w:t>
       </w:r>
     </w:p>
     <w:p>
@@ -7590,7 +7720,20 @@
           <w:color w:val="334155"/>
           <w:sz w:val="19"/>
         </w:rPr>
-        <w:t xml:space="preserve"> cấu hình môi trường, hỗ trợ nạp cấu hình nóng mà không cần build lại mã nguồn.</w:t>
+        <w:t xml:space="preserve"> cấu hình môi trường, hỗ trợ nạp cấu hình nóng mà không cần build</w:t>
+      </w:r>
+    </w:p>
+    <w:p>
+      <w:pPr>
+        <w:spacing w:before="20" w:after="60"/>
+      </w:pPr>
+      <w:r>
+        <w:rPr>
+          <w:rFonts w:ascii="Arial" w:hAnsi="Arial"/>
+          <w:color w:val="334155"/>
+          <w:sz w:val="19"/>
+        </w:rPr>
+        <w:t>lại mã nguồn.</w:t>
       </w:r>
     </w:p>
     <w:p>
@@ -7884,7 +8027,20 @@
           <w:color w:val="334155"/>
           <w:sz w:val="19"/>
         </w:rPr>
-        <w:t xml:space="preserve"> Trong môi trường phân tán với hàng ngàn tài xế, hai tài xế cùng bấm nhận 1 cuốc trong cùng 1 mili-giây có thể khiến chuyến bị gán trùng lặp, gây xung đột nghiêm trọng.</w:t>
+        <w:t xml:space="preserve"> Trong môi trường phân tán với hàng ngàn tài xế, hai tài xế cùng bấm nhận 1 cuốc trong cùng 1 mili-giây có</w:t>
+      </w:r>
+    </w:p>
+    <w:p>
+      <w:pPr>
+        <w:spacing w:before="20" w:after="60"/>
+      </w:pPr>
+      <w:r>
+        <w:rPr>
+          <w:rFonts w:ascii="Arial" w:hAnsi="Arial"/>
+          <w:color w:val="334155"/>
+          <w:sz w:val="19"/>
+        </w:rPr>
+        <w:t>thể khiến chuyến bị gán trùng lặp, gây xung đột nghiêm trọng.</w:t>
       </w:r>
     </w:p>
     <w:p>
@@ -7957,7 +8113,20 @@
           <w:color w:val="334155"/>
           <w:sz w:val="19"/>
         </w:rPr>
-        <w:t xml:space="preserve"> với TTL 5s. Chỉ request đầu tiên giành được khóa mới được đi tiếp.</w:t>
+        <w:t xml:space="preserve"> với TTL 5s. Chỉ</w:t>
+      </w:r>
+    </w:p>
+    <w:p>
+      <w:pPr>
+        <w:spacing w:before="20" w:after="60"/>
+      </w:pPr>
+      <w:r>
+        <w:rPr>
+          <w:rFonts w:ascii="Arial" w:hAnsi="Arial"/>
+          <w:color w:val="334155"/>
+          <w:sz w:val="19"/>
+        </w:rPr>
+        <w:t>request đầu tiên giành được khóa mới được đi tiếp.</w:t>
       </w:r>
     </w:p>
     <w:p>
@@ -8022,9 +8191,9 @@
               </w:rPr>
               <w:t xml:space="preserve">CREATE UNIQUE INDEX idx_trips_driver_active_unique </w:t>
               <w:br/>
-              <w:t xml:space="preserve">     ON trip.trips (driver_id) </w:t>
-              <w:br/>
-              <w:t xml:space="preserve">     WHERE status IN ('ACCEPTED', 'ARRIVING', 'IN_PROGRESS');</w:t>
+              <w:t xml:space="preserve">       ON trip.trips (driver_id) </w:t>
+              <w:br/>
+              <w:t xml:space="preserve">       WHERE status IN ('ACCEPTED', 'ARRIVING', 'IN_PROGRESS');</w:t>
             </w:r>
           </w:p>
         </w:tc>
@@ -8061,7 +8230,19 @@
           <w:color w:val="334155"/>
           <w:sz w:val="19"/>
         </w:rPr>
-        <w:t xml:space="preserve">, đảm bảo 1 tài xế </w:t>
+        <w:t>, đảm bảo 1 tài xế</w:t>
+      </w:r>
+    </w:p>
+    <w:p>
+      <w:pPr>
+        <w:spacing w:before="20" w:after="60"/>
+      </w:pPr>
+      <w:r>
+        <w:rPr>
+          <w:rFonts w:ascii="Arial" w:hAnsi="Arial"/>
+          <w:color w:val="334155"/>
+          <w:sz w:val="19"/>
+        </w:rPr>
       </w:r>
       <w:r>
         <w:rPr>
@@ -8120,7 +8301,20 @@
           <w:color w:val="334155"/>
           <w:sz w:val="19"/>
         </w:rPr>
-        <w:t xml:space="preserve"> Khi hoàn thành chuyến xe, nếu update database thành công nhưng mạng Kafka bị gián đoạn, sự kiện không được gửi đi, dẫn tới tài xế bị mất tiền chuyến xe (Dual-Write Problem).</w:t>
+        <w:t xml:space="preserve"> Khi hoàn thành chuyến xe, nếu update database thành công nhưng mạng Kafka bị gián đoạn, sự kiện không</w:t>
+      </w:r>
+    </w:p>
+    <w:p>
+      <w:pPr>
+        <w:spacing w:before="20" w:after="60"/>
+      </w:pPr>
+      <w:r>
+        <w:rPr>
+          <w:rFonts w:ascii="Arial" w:hAnsi="Arial"/>
+          <w:color w:val="334155"/>
+          <w:sz w:val="19"/>
+        </w:rPr>
+        <w:t>được gửi đi, dẫn tới tài xế bị mất tiền chuyến xe (Dual-Write Problem).</w:t>
       </w:r>
     </w:p>
     <w:p>
@@ -8165,7 +8359,20 @@
           <w:color w:val="334155"/>
           <w:sz w:val="19"/>
         </w:rPr>
-        <w:t xml:space="preserve"> trong cùng một Local Transaction với lệnh cập nhật </w:t>
+        <w:t xml:space="preserve"> trong cùng một Local Transaction với lệnh cập</w:t>
+      </w:r>
+    </w:p>
+    <w:p>
+      <w:pPr>
+        <w:spacing w:before="20" w:after="60"/>
+      </w:pPr>
+      <w:r>
+        <w:rPr>
+          <w:rFonts w:ascii="Arial" w:hAnsi="Arial"/>
+          <w:color w:val="334155"/>
+          <w:sz w:val="19"/>
+        </w:rPr>
+        <w:t xml:space="preserve">nhật </w:t>
       </w:r>
       <w:r>
         <w:rPr>
@@ -8181,7 +8388,20 @@
           <w:color w:val="334155"/>
           <w:sz w:val="19"/>
         </w:rPr>
-        <w:t>. Một Outbox Worker chạy ngầm quét bảng này và đẩy vào Kafka với cơ chế At-least-once Delivery, loại bỏ hoàn toàn nguy cơ mất dữ liệu tài chính.</w:t>
+        <w:t>. Một Outbox Worker chạy ngầm quét bảng này và đẩy vào Kafka với cơ chế At-least-once Delivery, loại</w:t>
+      </w:r>
+    </w:p>
+    <w:p>
+      <w:pPr>
+        <w:spacing w:before="20" w:after="60"/>
+      </w:pPr>
+      <w:r>
+        <w:rPr>
+          <w:rFonts w:ascii="Arial" w:hAnsi="Arial"/>
+          <w:color w:val="334155"/>
+          <w:sz w:val="19"/>
+        </w:rPr>
+        <w:t>bỏ hoàn toàn nguy cơ mất dữ liệu tài chính.</w:t>
       </w:r>
     </w:p>
     <w:p>
@@ -8240,7 +8460,20 @@
           <w:color w:val="334155"/>
           <w:sz w:val="19"/>
         </w:rPr>
-        <w:t xml:space="preserve"> trực tiếp vào database không để lại dấu vết kiểm toán, dễ bị hacker can thiệp hoặc sai lệch khi đối soát kế toán.</w:t>
+        <w:t xml:space="preserve"> trực tiếp vào database không để lại dấu vết kiểm</w:t>
+      </w:r>
+    </w:p>
+    <w:p>
+      <w:pPr>
+        <w:spacing w:before="20" w:after="60"/>
+      </w:pPr>
+      <w:r>
+        <w:rPr>
+          <w:rFonts w:ascii="Arial" w:hAnsi="Arial"/>
+          <w:color w:val="334155"/>
+          <w:sz w:val="19"/>
+        </w:rPr>
+        <w:t>toán, dễ bị hacker can thiệp hoặc sai lệch khi đối soát kế toán.</w:t>
       </w:r>
     </w:p>
     <w:p>
@@ -8317,7 +8550,19 @@
           <w:color w:val="334155"/>
           <w:sz w:val="19"/>
         </w:rPr>
-        <w:t xml:space="preserve"> hoặc </w:t>
+      </w:r>
+    </w:p>
+    <w:p>
+      <w:pPr>
+        <w:spacing w:before="20" w:after="60"/>
+      </w:pPr>
+      <w:r>
+        <w:rPr>
+          <w:rFonts w:ascii="Arial" w:hAnsi="Arial"/>
+          <w:color w:val="334155"/>
+          <w:sz w:val="19"/>
+        </w:rPr>
+        <w:t xml:space="preserve">hoặc </w:t>
       </w:r>
       <w:r>
         <w:rPr>
@@ -8365,7 +8610,20 @@
           <w:color w:val="334155"/>
           <w:sz w:val="19"/>
         </w:rPr>
-        <w:t>. Tuyệt đối không cho phép lệnh sửa hay xóa trong bảng này (Append-only).</w:t>
+        <w:t>. Tuyệt đối không cho</w:t>
+      </w:r>
+    </w:p>
+    <w:p>
+      <w:pPr>
+        <w:spacing w:before="20" w:after="60"/>
+      </w:pPr>
+      <w:r>
+        <w:rPr>
+          <w:rFonts w:ascii="Arial" w:hAnsi="Arial"/>
+          <w:color w:val="334155"/>
+          <w:sz w:val="19"/>
+        </w:rPr>
+        <w:t>phép lệnh sửa hay xóa trong bảng này (Append-only).</w:t>
       </w:r>
     </w:p>
     <w:p>
@@ -8393,7 +8651,19 @@
           <w:color w:val="334155"/>
           <w:sz w:val="19"/>
         </w:rPr>
-        <w:t xml:space="preserve">Vị trí thời gian thực của tài xế chỉ được broadcast cho đúng khách hàng của chuyến xe đó thông qua kênh riêng biệt </w:t>
+        <w:t>Vị trí thời gian thực của tài xế chỉ được broadcast cho đúng khách hàng của chuyến xe đó thông qua kênh riêng biệt</w:t>
+      </w:r>
+    </w:p>
+    <w:p>
+      <w:pPr>
+        <w:spacing w:before="20" w:after="60"/>
+      </w:pPr>
+      <w:r>
+        <w:rPr>
+          <w:rFonts w:ascii="Arial" w:hAnsi="Arial"/>
+          <w:color w:val="334155"/>
+          <w:sz w:val="19"/>
+        </w:rPr>
       </w:r>
       <w:r>
         <w:rPr>
@@ -8409,7 +8679,20 @@
           <w:color w:val="334155"/>
           <w:sz w:val="19"/>
         </w:rPr>
-        <w:t xml:space="preserve"> và chỉ mở trong thời gian cuốc xe đang diễn ra. Khi cuốc xe COMPLETED hoặc CANCELLED, kênh chia sẻ vị trí lập tức bị hủy.</w:t>
+        <w:t xml:space="preserve"> và chỉ mở trong thời gian cuốc xe đang diễn ra. Khi cuốc xe COMPLETED hoặc CANCELLED, kênh</w:t>
+      </w:r>
+    </w:p>
+    <w:p>
+      <w:pPr>
+        <w:spacing w:before="20" w:after="60"/>
+      </w:pPr>
+      <w:r>
+        <w:rPr>
+          <w:rFonts w:ascii="Arial" w:hAnsi="Arial"/>
+          <w:color w:val="334155"/>
+          <w:sz w:val="19"/>
+        </w:rPr>
+        <w:t>chia sẻ vị trí lập tức bị hủy.</w:t>
       </w:r>
     </w:p>
     <w:p>
@@ -8495,7 +8778,46 @@
           <w:color w:val="334155"/>
           <w:sz w:val="19"/>
         </w:rPr>
-        <w:t>, từ ranh giới thiết kế miền, cấu trúc cơ sở dữ liệu phân tán đến từng luồng nghiệp vụ chi tiết và giải pháp phòng thủ lỗi. Hệ thống đã được triển khai hoàn chỉnh, biên dịch thành công 100%, kiểm thử vượt qua toàn bộ test cases và sẵn sàng phục vụ kiểm thử thực tế cũng như triển khai hạ tầng đám mây.</w:t>
+        <w:t>, từ ranh</w:t>
+      </w:r>
+    </w:p>
+    <w:p>
+      <w:pPr>
+        <w:spacing w:before="20" w:after="60"/>
+      </w:pPr>
+      <w:r>
+        <w:rPr>
+          <w:rFonts w:ascii="Arial" w:hAnsi="Arial"/>
+          <w:color w:val="334155"/>
+          <w:sz w:val="19"/>
+        </w:rPr>
+        <w:t>giới thiết kế miền, cấu trúc cơ sở dữ liệu phân tán đến từng luồng nghiệp vụ chi tiết và giải pháp phòng thủ lỗi. Hệ</w:t>
+      </w:r>
+    </w:p>
+    <w:p>
+      <w:pPr>
+        <w:spacing w:before="20" w:after="60"/>
+      </w:pPr>
+      <w:r>
+        <w:rPr>
+          <w:rFonts w:ascii="Arial" w:hAnsi="Arial"/>
+          <w:color w:val="334155"/>
+          <w:sz w:val="19"/>
+        </w:rPr>
+        <w:t>thống đã được triển khai hoàn chỉnh, biên dịch thành công 100%, kiểm thử vượt qua toàn bộ test cases và sẵn sàng phục vụ</w:t>
+      </w:r>
+    </w:p>
+    <w:p>
+      <w:pPr>
+        <w:spacing w:before="20" w:after="60"/>
+      </w:pPr>
+      <w:r>
+        <w:rPr>
+          <w:rFonts w:ascii="Arial" w:hAnsi="Arial"/>
+          <w:color w:val="334155"/>
+          <w:sz w:val="19"/>
+        </w:rPr>
+        <w:t>kiểm thử thực tế cũng như triển khai hạ tầng đám mây.</w:t>
       </w:r>
     </w:p>
     <w:sectPr>

</xml_diff>